<commit_message>
Update thesis cover and source documents with new versions
</commit_message>
<xml_diff>
--- a/thesis/sources/Portada-TFG.docx
+++ b/thesis/sources/Portada-TFG.docx
@@ -871,16 +871,16 @@
         <mc:AlternateContent>
           <mc:Choice Requires="wps">
             <w:drawing>
-              <wp:anchor distT="0" distB="0" distL="114300" distR="114300" simplePos="0" relativeHeight="251661312" behindDoc="0" locked="0" layoutInCell="1" allowOverlap="1" wp14:anchorId="5B1848B7" wp14:editId="6951F6A7">
+              <wp:anchor distT="0" distB="0" distL="114300" distR="114300" simplePos="0" relativeHeight="251661312" behindDoc="0" locked="0" layoutInCell="1" allowOverlap="1" wp14:anchorId="5B1848B7" wp14:editId="652389F8">
                 <wp:simplePos x="0" y="0"/>
                 <wp:positionH relativeFrom="margin">
-                  <wp:posOffset>-190500</wp:posOffset>
+                  <wp:posOffset>-228600</wp:posOffset>
                 </wp:positionH>
                 <wp:positionV relativeFrom="paragraph">
-                  <wp:posOffset>1447165</wp:posOffset>
+                  <wp:posOffset>1390015</wp:posOffset>
                 </wp:positionV>
-                <wp:extent cx="6407150" cy="3984625"/>
-                <wp:effectExtent l="0" t="0" r="12700" b="0"/>
+                <wp:extent cx="6477000" cy="3984625"/>
+                <wp:effectExtent l="0" t="0" r="0" b="0"/>
                 <wp:wrapSquare wrapText="bothSides"/>
                 <wp:docPr id="85" name="Cuadro de texto 85"/>
                 <wp:cNvGraphicFramePr/>
@@ -891,7 +891,7 @@
                       <wps:spPr>
                         <a:xfrm>
                           <a:off x="0" y="0"/>
-                          <a:ext cx="6407150" cy="3984625"/>
+                          <a:ext cx="6477000" cy="3984625"/>
                         </a:xfrm>
                         <a:prstGeom prst="rect">
                           <a:avLst/>
@@ -1121,7 +1121,19 @@
                               <w:rPr>
                                 <w:rStyle w:val="Textoennegrita"/>
                               </w:rPr>
-                              <w:t>l'enton</w:t>
+                              <w:t>l'ento</w:t>
+                            </w:r>
+                            <w:r>
+                              <w:rPr>
+                                <w:rStyle w:val="Textoennegrita"/>
+                              </w:rPr>
+                              <w:t>r</w:t>
+                            </w:r>
+                            <w:r>
+                              <w:rPr>
+                                <w:rStyle w:val="Textoennegrita"/>
+                              </w:rPr>
+                              <w:t>n</w:t>
                             </w:r>
                             <w:proofErr w:type="spellEnd"/>
                             <w:r>
@@ -1276,7 +1288,7 @@
           </mc:Choice>
           <mc:Fallback>
             <w:pict>
-              <v:shape w14:anchorId="5B1848B7" id="Cuadro de texto 85" o:spid="_x0000_s1033" type="#_x0000_t202" style="position:absolute;margin-left:-15pt;margin-top:113.95pt;width:504.5pt;height:313.75pt;z-index:251661312;visibility:visible;mso-wrap-style:square;mso-width-percent:0;mso-height-percent:0;mso-wrap-distance-left:9pt;mso-wrap-distance-top:0;mso-wrap-distance-right:9pt;mso-wrap-distance-bottom:0;mso-position-horizontal:absolute;mso-position-horizontal-relative:margin;mso-position-vertical:absolute;mso-position-vertical-relative:text;mso-width-percent:0;mso-height-percent:0;mso-width-relative:margin;mso-height-relative:margin;v-text-anchor:top" o:gfxdata="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" filled="f" stroked="f" strokeweight=".5pt">
+              <v:shape w14:anchorId="5B1848B7" id="Cuadro de texto 85" o:spid="_x0000_s1033" type="#_x0000_t202" style="position:absolute;margin-left:-18pt;margin-top:109.45pt;width:510pt;height:313.75pt;z-index:251661312;visibility:visible;mso-wrap-style:square;mso-width-percent:0;mso-height-percent:0;mso-wrap-distance-left:9pt;mso-wrap-distance-top:0;mso-wrap-distance-right:9pt;mso-wrap-distance-bottom:0;mso-position-horizontal:absolute;mso-position-horizontal-relative:margin;mso-position-vertical:absolute;mso-position-vertical-relative:text;mso-width-percent:0;mso-height-percent:0;mso-width-relative:margin;mso-height-relative:margin;v-text-anchor:top" o:gfxdata="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" filled="f" stroked="f" strokeweight=".5pt">
                 <v:textbox inset="0,0,0,0">
                   <w:txbxContent>
                     <w:p>
@@ -1482,7 +1494,19 @@
                         <w:rPr>
                           <w:rStyle w:val="Textoennegrita"/>
                         </w:rPr>
-                        <w:t>l'enton</w:t>
+                        <w:t>l'ento</w:t>
+                      </w:r>
+                      <w:r>
+                        <w:rPr>
+                          <w:rStyle w:val="Textoennegrita"/>
+                        </w:rPr>
+                        <w:t>r</w:t>
+                      </w:r>
+                      <w:r>
+                        <w:rPr>
+                          <w:rStyle w:val="Textoennegrita"/>
+                        </w:rPr>
+                        <w:t>n</w:t>
                       </w:r>
                       <w:proofErr w:type="spellEnd"/>
                       <w:r>
@@ -2240,6 +2264,7 @@
     <w:lsdException w:name="HTML Sample" w:semiHidden="1" w:unhideWhenUsed="1"/>
     <w:lsdException w:name="HTML Typewriter" w:semiHidden="1" w:unhideWhenUsed="1"/>
     <w:lsdException w:name="HTML Variable" w:semiHidden="1" w:unhideWhenUsed="1"/>
+    <w:lsdException w:name="Normal Table" w:semiHidden="1" w:unhideWhenUsed="1"/>
     <w:lsdException w:name="annotation subject" w:semiHidden="1" w:unhideWhenUsed="1"/>
     <w:lsdException w:name="No List" w:semiHidden="1" w:unhideWhenUsed="1"/>
     <w:lsdException w:name="Outline List 1" w:semiHidden="1" w:unhideWhenUsed="1"/>
@@ -2282,8 +2307,11 @@
     <w:lsdException w:name="Table Contemporary" w:semiHidden="1" w:unhideWhenUsed="1"/>
     <w:lsdException w:name="Table Elegant" w:semiHidden="1" w:unhideWhenUsed="1"/>
     <w:lsdException w:name="Table Professional" w:semiHidden="1" w:unhideWhenUsed="1"/>
+    <w:lsdException w:name="Table Subtle 1" w:semiHidden="1" w:unhideWhenUsed="1"/>
     <w:lsdException w:name="Table Subtle 2" w:semiHidden="1" w:unhideWhenUsed="1"/>
     <w:lsdException w:name="Table Web 1" w:semiHidden="1" w:unhideWhenUsed="1"/>
+    <w:lsdException w:name="Table Web 2" w:semiHidden="1" w:unhideWhenUsed="1"/>
+    <w:lsdException w:name="Table Web 3" w:semiHidden="1" w:unhideWhenUsed="1"/>
     <w:lsdException w:name="Balloon Text" w:semiHidden="1" w:unhideWhenUsed="1"/>
     <w:lsdException w:name="Table Grid" w:uiPriority="39"/>
     <w:lsdException w:name="Table Theme" w:semiHidden="1" w:unhideWhenUsed="1"/>
@@ -2794,6 +2822,7 @@
     <w:rsid w:val="00A3537C"/>
     <w:rsid w:val="00AF0DB4"/>
     <w:rsid w:val="00B83418"/>
+    <w:rsid w:val="00C8744C"/>
     <w:rsid w:val="00E85F6E"/>
   </w:rsids>
   <m:mathPr>
@@ -2940,6 +2969,7 @@
     <w:lsdException w:name="HTML Sample" w:semiHidden="1" w:unhideWhenUsed="1"/>
     <w:lsdException w:name="HTML Typewriter" w:semiHidden="1" w:unhideWhenUsed="1"/>
     <w:lsdException w:name="HTML Variable" w:semiHidden="1" w:unhideWhenUsed="1"/>
+    <w:lsdException w:name="Normal Table" w:semiHidden="1" w:unhideWhenUsed="1"/>
     <w:lsdException w:name="annotation subject" w:semiHidden="1" w:unhideWhenUsed="1"/>
     <w:lsdException w:name="No List" w:semiHidden="1" w:unhideWhenUsed="1"/>
     <w:lsdException w:name="Outline List 1" w:semiHidden="1" w:unhideWhenUsed="1"/>
@@ -2982,8 +3012,11 @@
     <w:lsdException w:name="Table Contemporary" w:semiHidden="1" w:unhideWhenUsed="1"/>
     <w:lsdException w:name="Table Elegant" w:semiHidden="1" w:unhideWhenUsed="1"/>
     <w:lsdException w:name="Table Professional" w:semiHidden="1" w:unhideWhenUsed="1"/>
+    <w:lsdException w:name="Table Subtle 1" w:semiHidden="1" w:unhideWhenUsed="1"/>
     <w:lsdException w:name="Table Subtle 2" w:semiHidden="1" w:unhideWhenUsed="1"/>
     <w:lsdException w:name="Table Web 1" w:semiHidden="1" w:unhideWhenUsed="1"/>
+    <w:lsdException w:name="Table Web 2" w:semiHidden="1" w:unhideWhenUsed="1"/>
+    <w:lsdException w:name="Table Web 3" w:semiHidden="1" w:unhideWhenUsed="1"/>
     <w:lsdException w:name="Balloon Text" w:semiHidden="1" w:unhideWhenUsed="1"/>
     <w:lsdException w:name="Table Grid" w:uiPriority="39"/>
     <w:lsdException w:name="Table Theme" w:semiHidden="1" w:unhideWhenUsed="1"/>

</xml_diff>